<commit_message>
Add 5 new screenshots (login, signup, search, cart, contact) to report
</commit_message>
<xml_diff>
--- a/report/OneStepPharmacy_OJT_Report.docx
+++ b/report/OneStepPharmacy_OJT_Report.docx
@@ -2037,11 +2037,109 @@
         <w:jc w:val="both"/>
       </w:pPr>
       <w:r>
+        <w:t>OneStep Pharmacy implements a complete user authentication system with registration, login, and logout functionality. New users can create an account through the signup page, while existing users can log in securely. Figure 3.5 shows the login page with the authentication form, and Figure 3.6 shows the user registration page.</w:t>
+      </w:r>
+    </w:p>
+    <w:p>
+      <w:pPr>
+        <w:jc w:val="center"/>
+      </w:pPr>
+      <w:r>
+        <w:drawing>
+          <wp:inline xmlns:a="http://schemas.openxmlformats.org/drawingml/2006/main" xmlns:pic="http://schemas.openxmlformats.org/drawingml/2006/picture">
+            <wp:extent cx="4114800" cy="5628051"/>
+            <wp:docPr id="5" name="Picture 5"/>
+            <wp:cNvGraphicFramePr>
+              <a:graphicFrameLocks noChangeAspect="1"/>
+            </wp:cNvGraphicFramePr>
+            <a:graphic>
+              <a:graphicData uri="http://schemas.openxmlformats.org/drawingml/2006/picture">
+                <pic:pic>
+                  <pic:nvPicPr>
+                    <pic:cNvPr id="0" name="login.png"/>
+                    <pic:cNvPicPr/>
+                  </pic:nvPicPr>
+                  <pic:blipFill>
+                    <a:blip r:embed="rId15"/>
+                    <a:stretch>
+                      <a:fillRect/>
+                    </a:stretch>
+                  </pic:blipFill>
+                  <pic:spPr>
+                    <a:xfrm>
+                      <a:off x="0" y="0"/>
+                      <a:ext cx="4114800" cy="5628051"/>
+                    </a:xfrm>
+                    <a:prstGeom prst="rect"/>
+                  </pic:spPr>
+                </pic:pic>
+              </a:graphicData>
+            </a:graphic>
+          </wp:inline>
+        </w:drawing>
+      </w:r>
+    </w:p>
+    <w:p>
+      <w:pPr>
+        <w:jc w:val="center"/>
+      </w:pPr>
+      <w:r>
         <w:rPr>
-          <w:rFonts w:ascii="Times New Roman" w:hAnsi="Times New Roman"/>
-          <w:sz w:val="24"/>
+          <w:i/>
+          <w:sz w:val="20"/>
         </w:rPr>
-        <w:t>• To enable secure user authentication with registration, login, and logout functionality.</w:t>
+        <w:t>Figure 3.5: Login page with authentication form</w:t>
+      </w:r>
+    </w:p>
+    <w:p>
+      <w:pPr>
+        <w:jc w:val="center"/>
+      </w:pPr>
+      <w:r>
+        <w:drawing>
+          <wp:inline xmlns:a="http://schemas.openxmlformats.org/drawingml/2006/main" xmlns:pic="http://schemas.openxmlformats.org/drawingml/2006/picture">
+            <wp:extent cx="4114800" cy="9052560"/>
+            <wp:docPr id="6" name="Picture 6"/>
+            <wp:cNvGraphicFramePr>
+              <a:graphicFrameLocks noChangeAspect="1"/>
+            </wp:cNvGraphicFramePr>
+            <a:graphic>
+              <a:graphicData uri="http://schemas.openxmlformats.org/drawingml/2006/picture">
+                <pic:pic>
+                  <pic:nvPicPr>
+                    <pic:cNvPr id="0" name="singup.png"/>
+                    <pic:cNvPicPr/>
+                  </pic:nvPicPr>
+                  <pic:blipFill>
+                    <a:blip r:embed="rId16"/>
+                    <a:stretch>
+                      <a:fillRect/>
+                    </a:stretch>
+                  </pic:blipFill>
+                  <pic:spPr>
+                    <a:xfrm>
+                      <a:off x="0" y="0"/>
+                      <a:ext cx="4114800" cy="9052560"/>
+                    </a:xfrm>
+                    <a:prstGeom prst="rect"/>
+                  </pic:spPr>
+                </pic:pic>
+              </a:graphicData>
+            </a:graphic>
+          </wp:inline>
+        </w:drawing>
+      </w:r>
+    </w:p>
+    <w:p>
+      <w:pPr>
+        <w:jc w:val="center"/>
+      </w:pPr>
+      <w:r>
+        <w:rPr>
+          <w:i/>
+          <w:sz w:val="20"/>
+        </w:rPr>
+        <w:t>Figure 3.6: User registration / signup page</w:t>
       </w:r>
     </w:p>
     <w:p>
@@ -2404,11 +2502,7 @@
         <w:jc w:val="both"/>
       </w:pPr>
       <w:r>
-        <w:rPr>
-          <w:rFonts w:ascii="Times New Roman" w:hAnsi="Times New Roman"/>
-          <w:sz w:val="24"/>
-        </w:rPr>
-        <w:t>The product listing page provides a complete catalog of all available medicines, sorted with the newest products displayed first. Each product is shown in a card format with its image, name, price, and a brief description. The clean, organized layout makes it easy for users to browse through available medicines and quickly identify products of interest.</w:t>
+        <w:t>The product listing page provides a complete catalog of all available medicines, sorted with the newest products displayed first. Each product card shows the medicine name, image, price, stock status, and a link to view details or place an order. A search bar in the navigation header allows users to find products by name or description, with results displayed on a dedicated search page (Figure 3.7).</w:t>
       </w:r>
     </w:p>
     <w:p>
@@ -2464,6 +2558,57 @@
     </w:p>
     <w:p>
       <w:pPr>
+        <w:jc w:val="center"/>
+      </w:pPr>
+      <w:r>
+        <w:drawing>
+          <wp:inline xmlns:a="http://schemas.openxmlformats.org/drawingml/2006/main" xmlns:pic="http://schemas.openxmlformats.org/drawingml/2006/picture">
+            <wp:extent cx="4114800" cy="4760259"/>
+            <wp:docPr id="7" name="Picture 7"/>
+            <wp:cNvGraphicFramePr>
+              <a:graphicFrameLocks noChangeAspect="1"/>
+            </wp:cNvGraphicFramePr>
+            <a:graphic>
+              <a:graphicData uri="http://schemas.openxmlformats.org/drawingml/2006/picture">
+                <pic:pic>
+                  <pic:nvPicPr>
+                    <pic:cNvPr id="0" name="search.png"/>
+                    <pic:cNvPicPr/>
+                  </pic:nvPicPr>
+                  <pic:blipFill>
+                    <a:blip r:embed="rId17"/>
+                    <a:stretch>
+                      <a:fillRect/>
+                    </a:stretch>
+                  </pic:blipFill>
+                  <pic:spPr>
+                    <a:xfrm>
+                      <a:off x="0" y="0"/>
+                      <a:ext cx="4114800" cy="4760259"/>
+                    </a:xfrm>
+                    <a:prstGeom prst="rect"/>
+                  </pic:spPr>
+                </pic:pic>
+              </a:graphicData>
+            </a:graphic>
+          </wp:inline>
+        </w:drawing>
+      </w:r>
+    </w:p>
+    <w:p>
+      <w:pPr>
+        <w:jc w:val="center"/>
+      </w:pPr>
+      <w:r>
+        <w:rPr>
+          <w:i/>
+          <w:sz w:val="20"/>
+        </w:rPr>
+        <w:t>Figure 3.7: Search functionality with results</w:t>
+      </w:r>
+    </w:p>
+    <w:p>
+      <w:pPr>
         <w:pStyle w:val="ReportSubtitle"/>
       </w:pPr>
       <w:r>
@@ -2497,11 +2642,7 @@
         <w:jc w:val="both"/>
       </w:pPr>
       <w:r>
-        <w:rPr>
-          <w:rFonts w:ascii="Times New Roman" w:hAnsi="Times New Roman"/>
-          <w:sz w:val="24"/>
-        </w:rPr>
-        <w:t>The order placement system allows authenticated users to order medicines directly from the product detail page. When placing an order, users specify the desired quantity, which is validated against the available stock to prevent overselling. Once an order is placed, it is recorded in the database with a status of "Pending". Pharmacy staff can then update the order status through the admin dashboard to "Shipped" or "Delivered" as the order progresses. While the current implementation focuses on single-product orders, the database schema is designed to support more complex multi-item orders in future iterations.</w:t>
+        <w:t>The order placement system allows users to add products to a session-based shopping cart and proceed to checkout. The cart page (Figure 3.8) displays all selected items with quantities, individual prices, and the order total. Users can update quantities or remove items before checking out. The checkout page requires authentication and creates the final order records upon confirmation.</w:t>
       </w:r>
     </w:p>
     <w:p>
@@ -2578,6 +2719,57 @@
     </w:p>
     <w:p>
       <w:pPr>
+        <w:jc w:val="center"/>
+      </w:pPr>
+      <w:r>
+        <w:drawing>
+          <wp:inline xmlns:a="http://schemas.openxmlformats.org/drawingml/2006/main" xmlns:pic="http://schemas.openxmlformats.org/drawingml/2006/picture">
+            <wp:extent cx="4114800" cy="5810347"/>
+            <wp:docPr id="8" name="Picture 8"/>
+            <wp:cNvGraphicFramePr>
+              <a:graphicFrameLocks noChangeAspect="1"/>
+            </wp:cNvGraphicFramePr>
+            <a:graphic>
+              <a:graphicData uri="http://schemas.openxmlformats.org/drawingml/2006/picture">
+                <pic:pic>
+                  <pic:nvPicPr>
+                    <pic:cNvPr id="0" name="placeordercart.png"/>
+                    <pic:cNvPicPr/>
+                  </pic:nvPicPr>
+                  <pic:blipFill>
+                    <a:blip r:embed="rId18"/>
+                    <a:stretch>
+                      <a:fillRect/>
+                    </a:stretch>
+                  </pic:blipFill>
+                  <pic:spPr>
+                    <a:xfrm>
+                      <a:off x="0" y="0"/>
+                      <a:ext cx="4114800" cy="5810347"/>
+                    </a:xfrm>
+                    <a:prstGeom prst="rect"/>
+                  </pic:spPr>
+                </pic:pic>
+              </a:graphicData>
+            </a:graphic>
+          </wp:inline>
+        </w:drawing>
+      </w:r>
+    </w:p>
+    <w:p>
+      <w:pPr>
+        <w:jc w:val="center"/>
+      </w:pPr>
+      <w:r>
+        <w:rPr>
+          <w:i/>
+          <w:sz w:val="20"/>
+        </w:rPr>
+        <w:t>Figure 3.8: Shopping cart and checkout page</w:t>
+      </w:r>
+    </w:p>
+    <w:p>
+      <w:pPr>
         <w:pStyle w:val="ReportSubtitle"/>
       </w:pPr>
       <w:r>
@@ -2611,11 +2803,7 @@
         <w:jc w:val="both"/>
       </w:pPr>
       <w:r>
-        <w:rPr>
-          <w:rFonts w:ascii="Times New Roman" w:hAnsi="Times New Roman"/>
-          <w:sz w:val="24"/>
-        </w:rPr>
-        <w:t>The About page introduces the developer and features an interactive 3D model viewer that displays pharmaceutical shelf models. The viewer uses the &lt;model-viewer&gt; web component loaded from Google's CDN, supporting drag-to-rotate, scroll-to-zoom, and auto-rotate functionality. Users can switch between six different OBJ pharmacy models using numbered buttons below the viewer. A texture image (Resto.png) is mapped onto the models to provide a realistic appearance. The viewer wrapper uses CSS custom properties for consistent dark mode styling.</w:t>
+        <w:t>The About page introduces the developer, the team, and features an interactive 3D model viewer that displays pharmaceutical shelf models using Three.js. Additional static pages including Contact Us (Figure 3.9), Careers, Help Center, Privacy Policy, and Terms of Service provide comprehensive information about the platform.</w:t>
       </w:r>
     </w:p>
     <w:p>
@@ -2671,6 +2859,57 @@
     </w:p>
     <w:p>
       <w:pPr>
+        <w:jc w:val="center"/>
+      </w:pPr>
+      <w:r>
+        <w:drawing>
+          <wp:inline xmlns:a="http://schemas.openxmlformats.org/drawingml/2006/main" xmlns:pic="http://schemas.openxmlformats.org/drawingml/2006/picture">
+            <wp:extent cx="4114800" cy="1977354"/>
+            <wp:docPr id="9" name="Picture 9"/>
+            <wp:cNvGraphicFramePr>
+              <a:graphicFrameLocks noChangeAspect="1"/>
+            </wp:cNvGraphicFramePr>
+            <a:graphic>
+              <a:graphicData uri="http://schemas.openxmlformats.org/drawingml/2006/picture">
+                <pic:pic>
+                  <pic:nvPicPr>
+                    <pic:cNvPr id="0" name="contactus.png"/>
+                    <pic:cNvPicPr/>
+                  </pic:nvPicPr>
+                  <pic:blipFill>
+                    <a:blip r:embed="rId19"/>
+                    <a:stretch>
+                      <a:fillRect/>
+                    </a:stretch>
+                  </pic:blipFill>
+                  <pic:spPr>
+                    <a:xfrm>
+                      <a:off x="0" y="0"/>
+                      <a:ext cx="4114800" cy="1977354"/>
+                    </a:xfrm>
+                    <a:prstGeom prst="rect"/>
+                  </pic:spPr>
+                </pic:pic>
+              </a:graphicData>
+            </a:graphic>
+          </wp:inline>
+        </w:drawing>
+      </w:r>
+    </w:p>
+    <w:p>
+      <w:pPr>
+        <w:jc w:val="center"/>
+      </w:pPr>
+      <w:r>
+        <w:rPr>
+          <w:i/>
+          <w:sz w:val="20"/>
+        </w:rPr>
+        <w:t>Figure 3.9: Contact Us page with contact information cards</w:t>
+      </w:r>
+    </w:p>
+    <w:p>
+      <w:pPr>
         <w:pStyle w:val="ReportSubtitle"/>
       </w:pPr>
       <w:r>
@@ -2936,11 +3175,7 @@
         <w:jc w:val="both"/>
       </w:pPr>
       <w:r>
-        <w:rPr>
-          <w:rFonts w:ascii="Times New Roman" w:hAnsi="Times New Roman"/>
-          <w:sz w:val="24"/>
-        </w:rPr>
-        <w:t>• No Shopping Cart: The current implementation supports only single-product ordering. A multi-item shopping cart with quantity management was not developed due to time constraints.</w:t>
+        <w:t>• No Persistent Cart: The session-based shopping cart does not persist across browser sessions or devices, requiring users to complete their checkout in a single visit.</w:t>
       </w:r>
     </w:p>
     <w:p>
@@ -2975,11 +3210,7 @@
         <w:jc w:val="both"/>
       </w:pPr>
       <w:r>
-        <w:rPr>
-          <w:rFonts w:ascii="Times New Roman" w:hAnsi="Times New Roman"/>
-          <w:sz w:val="24"/>
-        </w:rPr>
-        <w:t>• No Search or Filtering: The product catalog lacks search functionality and category-based filtering, requiring users to browse through all available products.</w:t>
+        <w:t>• Advanced Search and Filtering: Enhancing the current search with category-based filtering, price range filters, autocomplete suggestions, and sorted results.</w:t>
       </w:r>
     </w:p>
     <w:p>
@@ -3035,11 +3266,7 @@
         <w:jc w:val="both"/>
       </w:pPr>
       <w:r>
-        <w:rPr>
-          <w:rFonts w:ascii="Times New Roman" w:hAnsi="Times New Roman"/>
-          <w:sz w:val="24"/>
-        </w:rPr>
-        <w:t>• Shopping Cart: Implementing a full shopping cart system that allows users to add multiple items, update quantities, and proceed to a consolidated checkout.</w:t>
+        <w:t>• Persistent Shopping Cart: Upgrading the session-based cart to a database-backed cart that persists across devices and supports saved items for future orders.</w:t>
       </w:r>
     </w:p>
     <w:p>
@@ -3126,11 +3353,7 @@
         <w:jc w:val="both"/>
       </w:pPr>
       <w:r>
-        <w:rPr>
-          <w:rFonts w:ascii="Times New Roman" w:hAnsi="Times New Roman"/>
-          <w:sz w:val="24"/>
-        </w:rPr>
-        <w:t>• Contact and Inquiry Page: Adding a contact form and chatbot integration for customer inquiries and support.</w:t>
+        <w:t>• Enhanced Contact Features: Expanding the current contact page with a live chat system, inquiry form with file uploads, and chatbot integration for 24/7 customer support.</w:t>
       </w:r>
     </w:p>
     <w:p>

</xml_diff>

<commit_message>
Fix report: move images to correct sections, shorten descriptions, add footer screenshot, update Three.js refs
</commit_message>
<xml_diff>
--- a/report/OneStepPharmacy_OJT_Report.docx
+++ b/report/OneStepPharmacy_OJT_Report.docx
@@ -2033,15 +2033,6 @@
     </w:p>
     <w:p>
       <w:pPr>
-        <w:spacing w:before="0" w:after="120"/>
-        <w:jc w:val="both"/>
-      </w:pPr>
-      <w:r>
-        <w:t>OneStep Pharmacy implements a complete user authentication system with registration, login, and logout functionality. New users can create an account through the signup page, while existing users can log in securely. Figure 3.5 shows the login page with the authentication form, and Figure 3.6 shows the user registration page.</w:t>
-      </w:r>
-    </w:p>
-    <w:p>
-      <w:pPr>
         <w:jc w:val="center"/>
       </w:pPr>
       <w:r>
@@ -2084,18 +2075,6 @@
         <w:jc w:val="center"/>
       </w:pPr>
       <w:r>
-        <w:rPr>
-          <w:i/>
-          <w:sz w:val="20"/>
-        </w:rPr>
-        <w:t>Figure 3.5: Login page with authentication form</w:t>
-      </w:r>
-    </w:p>
-    <w:p>
-      <w:pPr>
-        <w:jc w:val="center"/>
-      </w:pPr>
-      <w:r>
         <w:drawing>
           <wp:inline xmlns:a="http://schemas.openxmlformats.org/drawingml/2006/main" xmlns:pic="http://schemas.openxmlformats.org/drawingml/2006/picture">
             <wp:extent cx="4114800" cy="9052560"/>
@@ -2132,18 +2111,6 @@
     </w:p>
     <w:p>
       <w:pPr>
-        <w:jc w:val="center"/>
-      </w:pPr>
-      <w:r>
-        <w:rPr>
-          <w:i/>
-          <w:sz w:val="20"/>
-        </w:rPr>
-        <w:t>Figure 3.6: User registration / signup page</w:t>
-      </w:r>
-    </w:p>
-    <w:p>
-      <w:pPr>
         <w:spacing w:before="0" w:after="120"/>
         <w:jc w:val="both"/>
       </w:pPr>
@@ -2307,11 +2274,7 @@
         <w:jc w:val="both"/>
       </w:pPr>
       <w:r>
-        <w:rPr>
-          <w:rFonts w:ascii="Times New Roman" w:hAnsi="Times New Roman"/>
-          <w:sz w:val="24"/>
-        </w:rPr>
-        <w:t>For 3D visualization, the platform integrates the &lt;model-viewer&gt; web component, loaded from a CDN, to display interactive 3D OBJ models of pharmaceutical shelves on the About page, with a texture image mapped onto the models.</w:t>
+        <w:t>For 3D visualization, the platform integrates Three.js to display interactive 3D OBJ models of pharmaceutical shelves on the About page.</w:t>
       </w:r>
     </w:p>
     <w:p>
@@ -2502,7 +2465,7 @@
         <w:jc w:val="both"/>
       </w:pPr>
       <w:r>
-        <w:t>The product listing page provides a complete catalog of all available medicines, sorted with the newest products displayed first. Each product card shows the medicine name, image, price, stock status, and a link to view details or place an order. A search bar in the navigation header allows users to find products by name or description, with results displayed on a dedicated search page (Figure 3.7).</w:t>
+        <w:t>The product listing page displays all medicines in a responsive card grid. A search bar in the nav header allows finding products by name (Figure 3.7).</w:t>
       </w:r>
     </w:p>
     <w:p>
@@ -2621,11 +2584,109 @@
         <w:jc w:val="both"/>
       </w:pPr>
       <w:r>
+        <w:t>The authentication system provides user registration (Figure 3.6) and login (Figure 3.5) functionality.</w:t>
+      </w:r>
+    </w:p>
+    <w:p>
+      <w:pPr>
+        <w:jc w:val="center"/>
+      </w:pPr>
+      <w:r>
+        <w:drawing>
+          <wp:inline xmlns:a="http://schemas.openxmlformats.org/drawingml/2006/main" xmlns:pic="http://schemas.openxmlformats.org/drawingml/2006/picture">
+            <wp:extent cx="3657600" cy="5002712"/>
+            <wp:docPr id="10" name="Picture 10"/>
+            <wp:cNvGraphicFramePr>
+              <a:graphicFrameLocks noChangeAspect="1"/>
+            </wp:cNvGraphicFramePr>
+            <a:graphic>
+              <a:graphicData uri="http://schemas.openxmlformats.org/drawingml/2006/picture">
+                <pic:pic>
+                  <pic:nvPicPr>
+                    <pic:cNvPr id="0" name="image.png"/>
+                    <pic:cNvPicPr/>
+                  </pic:nvPicPr>
+                  <pic:blipFill>
+                    <a:blip r:embed="rId15"/>
+                    <a:stretch>
+                      <a:fillRect/>
+                    </a:stretch>
+                  </pic:blipFill>
+                  <pic:spPr>
+                    <a:xfrm>
+                      <a:off x="0" y="0"/>
+                      <a:ext cx="3657600" cy="5002712"/>
+                    </a:xfrm>
+                    <a:prstGeom prst="rect"/>
+                  </pic:spPr>
+                </pic:pic>
+              </a:graphicData>
+            </a:graphic>
+          </wp:inline>
+        </w:drawing>
+      </w:r>
+    </w:p>
+    <w:p>
+      <w:pPr>
+        <w:jc w:val="center"/>
+      </w:pPr>
+      <w:r>
         <w:rPr>
-          <w:rFonts w:ascii="Times New Roman" w:hAnsi="Times New Roman"/>
-          <w:sz w:val="24"/>
+          <w:i/>
+          <w:sz w:val="20"/>
         </w:rPr>
-        <w:t>OneStep Pharmacy implements a complete user authentication system with registration, login, and logout functionality. New users can create an account by providing their username, email, password, and optional profile information including phone number and address. The system uses session-based authentication with Django's built-in authentication backend, CSRF protection tokens on all forms to prevent cross-site request forgery attacks, and HTTP-only cookies for secure session management. Authenticated users are identified by a personalized greeting in the navigation bar.</w:t>
+        <w:t>Figure 3.5: Login page with authentication form</w:t>
+      </w:r>
+    </w:p>
+    <w:p>
+      <w:pPr>
+        <w:jc w:val="center"/>
+      </w:pPr>
+      <w:r>
+        <w:drawing>
+          <wp:inline xmlns:a="http://schemas.openxmlformats.org/drawingml/2006/main" xmlns:pic="http://schemas.openxmlformats.org/drawingml/2006/picture">
+            <wp:extent cx="3657600" cy="8046720"/>
+            <wp:docPr id="11" name="Picture 11"/>
+            <wp:cNvGraphicFramePr>
+              <a:graphicFrameLocks noChangeAspect="1"/>
+            </wp:cNvGraphicFramePr>
+            <a:graphic>
+              <a:graphicData uri="http://schemas.openxmlformats.org/drawingml/2006/picture">
+                <pic:pic>
+                  <pic:nvPicPr>
+                    <pic:cNvPr id="0" name="image.png"/>
+                    <pic:cNvPicPr/>
+                  </pic:nvPicPr>
+                  <pic:blipFill>
+                    <a:blip r:embed="rId16"/>
+                    <a:stretch>
+                      <a:fillRect/>
+                    </a:stretch>
+                  </pic:blipFill>
+                  <pic:spPr>
+                    <a:xfrm>
+                      <a:off x="0" y="0"/>
+                      <a:ext cx="3657600" cy="8046720"/>
+                    </a:xfrm>
+                    <a:prstGeom prst="rect"/>
+                  </pic:spPr>
+                </pic:pic>
+              </a:graphicData>
+            </a:graphic>
+          </wp:inline>
+        </w:drawing>
+      </w:r>
+    </w:p>
+    <w:p>
+      <w:pPr>
+        <w:jc w:val="center"/>
+      </w:pPr>
+      <w:r>
+        <w:rPr>
+          <w:i/>
+          <w:sz w:val="20"/>
+        </w:rPr>
+        <w:t>Figure 3.6: User registration / signup page</w:t>
       </w:r>
     </w:p>
     <w:p>
@@ -2642,7 +2703,58 @@
         <w:jc w:val="both"/>
       </w:pPr>
       <w:r>
-        <w:t>The order placement system allows users to add products to a session-based shopping cart and proceed to checkout. The cart page (Figure 3.8) displays all selected items with quantities, individual prices, and the order total. Users can update quantities or remove items before checking out. The checkout page requires authentication and creates the final order records upon confirmation.</w:t>
+        <w:t>Users can add products to a session-based cart and proceed to checkout. The cart page displays selected items with quantities and totals.</w:t>
+      </w:r>
+    </w:p>
+    <w:p>
+      <w:pPr>
+        <w:jc w:val="center"/>
+      </w:pPr>
+      <w:r>
+        <w:drawing>
+          <wp:inline xmlns:a="http://schemas.openxmlformats.org/drawingml/2006/main" xmlns:pic="http://schemas.openxmlformats.org/drawingml/2006/picture">
+            <wp:extent cx="3657600" cy="5164753"/>
+            <wp:docPr id="12" name="Picture 12"/>
+            <wp:cNvGraphicFramePr>
+              <a:graphicFrameLocks noChangeAspect="1"/>
+            </wp:cNvGraphicFramePr>
+            <a:graphic>
+              <a:graphicData uri="http://schemas.openxmlformats.org/drawingml/2006/picture">
+                <pic:pic>
+                  <pic:nvPicPr>
+                    <pic:cNvPr id="0" name="image.png"/>
+                    <pic:cNvPicPr/>
+                  </pic:nvPicPr>
+                  <pic:blipFill>
+                    <a:blip r:embed="rId18"/>
+                    <a:stretch>
+                      <a:fillRect/>
+                    </a:stretch>
+                  </pic:blipFill>
+                  <pic:spPr>
+                    <a:xfrm>
+                      <a:off x="0" y="0"/>
+                      <a:ext cx="3657600" cy="5164753"/>
+                    </a:xfrm>
+                    <a:prstGeom prst="rect"/>
+                  </pic:spPr>
+                </pic:pic>
+              </a:graphicData>
+            </a:graphic>
+          </wp:inline>
+        </w:drawing>
+      </w:r>
+    </w:p>
+    <w:p>
+      <w:pPr>
+        <w:jc w:val="center"/>
+      </w:pPr>
+      <w:r>
+        <w:rPr>
+          <w:i/>
+          <w:sz w:val="20"/>
+        </w:rPr>
+        <w:t>Figure 3.8: Shopping cart and checkout page</w:t>
       </w:r>
     </w:p>
     <w:p>
@@ -2659,11 +2771,7 @@
         <w:jc w:val="both"/>
       </w:pPr>
       <w:r>
-        <w:rPr>
-          <w:rFonts w:ascii="Times New Roman" w:hAnsi="Times New Roman"/>
-          <w:sz w:val="24"/>
-        </w:rPr>
-        <w:t>The product detail page provides comprehensive information about a specific medicine. The page displays a large product image, the medicine name, price, a detailed description, current stock status, and expiry date. Authenticated users see an "Order Now" button with a quantity selector, allowing them to place an order immediately. The page also includes navigation links back to the product catalog, creating a seamless browsing experience.</w:t>
+        <w:t>The product detail page displays the medicine image, price, stock level, expiry date, and Add to Cart / Buy Now options.</w:t>
       </w:r>
     </w:p>
     <w:p>
@@ -2758,18 +2866,6 @@
     </w:p>
     <w:p>
       <w:pPr>
-        <w:jc w:val="center"/>
-      </w:pPr>
-      <w:r>
-        <w:rPr>
-          <w:i/>
-          <w:sz w:val="20"/>
-        </w:rPr>
-        <w:t>Figure 3.8: Shopping cart and checkout page</w:t>
-      </w:r>
-    </w:p>
-    <w:p>
-      <w:pPr>
         <w:pStyle w:val="ReportSubtitle"/>
       </w:pPr>
       <w:r>
@@ -2803,7 +2899,7 @@
         <w:jc w:val="both"/>
       </w:pPr>
       <w:r>
-        <w:t>The About page introduces the developer, the team, and features an interactive 3D model viewer that displays pharmaceutical shelf models using Three.js. Additional static pages including Contact Us (Figure 3.9), Careers, Help Center, Privacy Policy, and Terms of Service provide comprehensive information about the platform.</w:t>
+        <w:t>The About page features an interactive 3D pharmacy model viewer using Three.js, along with Contact Us and other static pages.</w:t>
       </w:r>
     </w:p>
     <w:p>
@@ -2917,6 +3013,65 @@
       </w:r>
     </w:p>
     <w:p>
+      <w:r>
+        <w:rPr>
+          <w:sz w:val="24"/>
+        </w:rPr>
+        <w:t>The platform footer provides navigation links, social media integration, and newsletter signup.</w:t>
+      </w:r>
+    </w:p>
+    <w:p>
+      <w:pPr>
+        <w:jc w:val="center"/>
+      </w:pPr>
+      <w:r>
+        <w:drawing>
+          <wp:inline xmlns:a="http://schemas.openxmlformats.org/drawingml/2006/main" xmlns:pic="http://schemas.openxmlformats.org/drawingml/2006/picture">
+            <wp:extent cx="4114800" cy="1023988"/>
+            <wp:docPr id="13" name="Picture 13"/>
+            <wp:cNvGraphicFramePr>
+              <a:graphicFrameLocks noChangeAspect="1"/>
+            </wp:cNvGraphicFramePr>
+            <a:graphic>
+              <a:graphicData uri="http://schemas.openxmlformats.org/drawingml/2006/picture">
+                <pic:pic>
+                  <pic:nvPicPr>
+                    <pic:cNvPr id="0" name="footer.png"/>
+                    <pic:cNvPicPr/>
+                  </pic:nvPicPr>
+                  <pic:blipFill>
+                    <a:blip r:embed="rId20"/>
+                    <a:stretch>
+                      <a:fillRect/>
+                    </a:stretch>
+                  </pic:blipFill>
+                  <pic:spPr>
+                    <a:xfrm>
+                      <a:off x="0" y="0"/>
+                      <a:ext cx="4114800" cy="1023988"/>
+                    </a:xfrm>
+                    <a:prstGeom prst="rect"/>
+                  </pic:spPr>
+                </pic:pic>
+              </a:graphicData>
+            </a:graphic>
+          </wp:inline>
+        </w:drawing>
+      </w:r>
+    </w:p>
+    <w:p>
+      <w:pPr>
+        <w:jc w:val="center"/>
+      </w:pPr>
+      <w:r>
+        <w:rPr>
+          <w:i/>
+          <w:sz w:val="20"/>
+        </w:rPr>
+        <w:t>Figure 3.10: Website footer with navigation and social links</w:t>
+      </w:r>
+    </w:p>
+    <w:p>
       <w:pPr>
         <w:spacing w:before="0" w:after="120"/>
         <w:jc w:val="both"/>
@@ -3055,11 +3210,7 @@
         <w:jc w:val="both"/>
       </w:pPr>
       <w:r>
-        <w:rPr>
-          <w:rFonts w:ascii="Times New Roman" w:hAnsi="Times New Roman"/>
-          <w:sz w:val="24"/>
-        </w:rPr>
-        <w:t>• 3D Web Integration with model-viewer: Embedding interactive 3D models in a web page using the &lt;model-viewer&gt; web component with OBJ file format support.</w:t>
+        <w:t>• 3D Web Integration with Three.js: Embedding interactive 3D models using the Three.js library with OBJ file loading and OrbitControls.</w:t>
       </w:r>
     </w:p>
     <w:p>
@@ -3210,7 +3361,7 @@
         <w:jc w:val="both"/>
       </w:pPr>
       <w:r>
-        <w:t>• Advanced Search and Filtering: Enhancing the current search with category-based filtering, price range filters, autocomplete suggestions, and sorted results.</w:t>
+        <w:t>• Limited Search and Filtering: The product search feature supports basic name and description matching without advanced filtering or category-based search.</w:t>
       </w:r>
     </w:p>
     <w:p>
@@ -3301,11 +3452,7 @@
         <w:jc w:val="both"/>
       </w:pPr>
       <w:r>
-        <w:rPr>
-          <w:rFonts w:ascii="Times New Roman" w:hAnsi="Times New Roman"/>
-          <w:sz w:val="24"/>
-        </w:rPr>
-        <w:t>• Search and Filtering: Implementing full-text search across product names and descriptions, along with category-based filtering and price range sorting.</w:t>
+        <w:t>• Advanced Search and Filtering: Enhancing the current search with category-based filtering and autocomplete suggestions.</w:t>
       </w:r>
     </w:p>
     <w:p>
@@ -3543,11 +3690,7 @@
         <w:spacing w:before="0" w:after="0"/>
       </w:pPr>
       <w:r>
-        <w:rPr>
-          <w:rFonts w:ascii="Times New Roman" w:hAnsi="Times New Roman"/>
-          <w:sz w:val="24"/>
-        </w:rPr>
-        <w:t>4.  Google Model Viewer: https://modelviewer.dev/</w:t>
+        <w:t>4.  Three.js (3D Library): https://threejs.org/</w:t>
       </w:r>
     </w:p>
     <w:p>

</xml_diff>

<commit_message>
Fix: set signature lines to single spacing (not double like body text)
</commit_message>
<xml_diff>
--- a/report/OneStepPharmacy_OJT_Report.docx
+++ b/report/OneStepPharmacy_OJT_Report.docx
@@ -21,6 +21,7 @@
     <w:p>
       <w:pPr>
         <w:pStyle w:val="ReportTitle"/>
+        <w:spacing w:line="240" w:lineRule="auto"/>
       </w:pPr>
       <w:r>
         <w:t>Shivapuri Secondary School, Maharajgunj, Kathmandu</w:t>
@@ -71,6 +72,7 @@
     <w:p>
       <w:pPr>
         <w:pStyle w:val="ReportTitle"/>
+        <w:spacing w:line="240" w:lineRule="auto"/>
       </w:pPr>
       <w:r>
         <w:t>Submitted By:</w:t>
@@ -92,6 +94,7 @@
     <w:p>
       <w:pPr>
         <w:pStyle w:val="ReportTitle"/>
+        <w:spacing w:line="240" w:lineRule="auto"/>
       </w:pPr>
       <w:r>
         <w:t>Submitted To:</w:t>
@@ -147,7 +150,7 @@
     </w:p>
     <w:p>
       <w:pPr>
-        <w:spacing w:before="0" w:after="120"/>
+        <w:spacing w:before="0" w:after="0" w:line="240" w:lineRule="auto"/>
         <w:jc w:val="both"/>
       </w:pPr>
       <w:r>
@@ -196,6 +199,7 @@
     </w:p>
     <w:p>
       <w:pPr>
+        <w:spacing w:line="240" w:lineRule="auto"/>
         <w:jc w:val="right"/>
       </w:pPr>
       <w:r>
@@ -209,6 +213,7 @@
     </w:p>
     <w:p>
       <w:pPr>
+        <w:spacing w:line="240" w:lineRule="auto"/>
         <w:jc w:val="right"/>
       </w:pPr>
       <w:r>
@@ -222,6 +227,7 @@
     </w:p>
     <w:p>
       <w:pPr>
+        <w:spacing w:line="240" w:lineRule="auto"/>
         <w:jc w:val="right"/>
       </w:pPr>
       <w:r>
@@ -261,7 +267,7 @@
     </w:p>
     <w:p>
       <w:pPr>
-        <w:spacing w:before="0" w:after="120"/>
+        <w:spacing w:before="0" w:after="0" w:line="240" w:lineRule="auto"/>
         <w:jc w:val="both"/>
       </w:pPr>
       <w:r>
@@ -323,6 +329,7 @@
     </w:p>
     <w:p>
       <w:pPr>
+        <w:spacing w:line="240" w:lineRule="auto"/>
         <w:jc w:val="right"/>
       </w:pPr>
       <w:r>
@@ -336,6 +343,7 @@
     </w:p>
     <w:p>
       <w:pPr>
+        <w:spacing w:line="240" w:lineRule="auto"/>
         <w:jc w:val="right"/>
       </w:pPr>
       <w:r>
@@ -349,6 +357,7 @@
     </w:p>
     <w:p>
       <w:pPr>
+        <w:spacing w:line="240" w:lineRule="auto"/>
         <w:jc w:val="right"/>
       </w:pPr>
       <w:r>
@@ -362,6 +371,7 @@
     </w:p>
     <w:p>
       <w:pPr>
+        <w:spacing w:line="240" w:lineRule="auto"/>
         <w:jc w:val="right"/>
       </w:pPr>
       <w:r>
@@ -388,7 +398,7 @@
     </w:p>
     <w:p>
       <w:pPr>
-        <w:spacing w:before="0" w:after="120"/>
+        <w:spacing w:before="0" w:after="0" w:line="240" w:lineRule="auto"/>
         <w:jc w:val="both"/>
       </w:pPr>
       <w:r>
@@ -424,6 +434,7 @@
     </w:p>
     <w:p>
       <w:pPr>
+        <w:spacing w:line="240" w:lineRule="auto"/>
         <w:jc w:val="right"/>
       </w:pPr>
       <w:r>
@@ -437,6 +448,7 @@
     </w:p>
     <w:p>
       <w:pPr>
+        <w:spacing w:line="240" w:lineRule="auto"/>
         <w:jc w:val="right"/>
       </w:pPr>
       <w:r>
@@ -450,6 +462,7 @@
     </w:p>
     <w:p>
       <w:pPr>
+        <w:spacing w:line="240" w:lineRule="auto"/>
         <w:jc w:val="right"/>
       </w:pPr>
       <w:r>
@@ -463,6 +476,7 @@
     </w:p>
     <w:p>
       <w:pPr>
+        <w:spacing w:line="240" w:lineRule="auto"/>
         <w:jc w:val="right"/>
       </w:pPr>
       <w:r>
@@ -541,7 +555,7 @@
     </w:p>
     <w:p>
       <w:pPr>
-        <w:spacing w:before="0" w:after="120"/>
+        <w:spacing w:before="0" w:after="0" w:line="240" w:lineRule="auto"/>
         <w:jc w:val="both"/>
       </w:pPr>
       <w:r>
@@ -554,7 +568,7 @@
     </w:p>
     <w:p>
       <w:pPr>
-        <w:spacing w:before="0" w:after="120"/>
+        <w:spacing w:before="0" w:after="0" w:line="240" w:lineRule="auto"/>
         <w:jc w:val="both"/>
       </w:pPr>
       <w:r>
@@ -567,7 +581,7 @@
     </w:p>
     <w:p>
       <w:pPr>
-        <w:spacing w:before="0" w:after="120"/>
+        <w:spacing w:before="0" w:after="0" w:line="240" w:lineRule="auto"/>
         <w:jc w:val="both"/>
       </w:pPr>
       <w:r>
@@ -2184,7 +2198,7 @@
     </w:p>
     <w:p>
       <w:pPr>
-        <w:spacing w:before="0" w:after="120"/>
+        <w:spacing w:before="0" w:after="0" w:line="240" w:lineRule="auto"/>
         <w:jc w:val="both"/>
       </w:pPr>
       <w:r>
@@ -2197,7 +2211,7 @@
     </w:p>
     <w:p>
       <w:pPr>
-        <w:spacing w:before="0" w:after="120"/>
+        <w:spacing w:before="0" w:after="0" w:line="240" w:lineRule="auto"/>
         <w:jc w:val="both"/>
       </w:pPr>
       <w:r>

</xml_diff>

<commit_message>
Fix: single-space cover page and all signature lines
</commit_message>
<xml_diff>
--- a/report/OneStepPharmacy_OJT_Report.docx
+++ b/report/OneStepPharmacy_OJT_Report.docx
@@ -5,6 +5,7 @@
     <w:p>
       <w:pPr>
         <w:pStyle w:val="ReportTitle"/>
+        <w:spacing w:line="240" w:lineRule="auto"/>
       </w:pPr>
       <w:r>
         <w:t>On-The-Job Training (OJT) Report on</w:t>
@@ -13,6 +14,7 @@
     <w:p>
       <w:pPr>
         <w:pStyle w:val="ReportTitle"/>
+        <w:spacing w:line="240" w:lineRule="auto"/>
       </w:pPr>
       <w:r>
         <w:t>OneStep Pharmacy E-commerce at</w:t>
@@ -35,6 +37,7 @@
     <w:p>
       <w:pPr>
         <w:pStyle w:val="ReportTitle"/>
+        <w:spacing w:line="240" w:lineRule="auto"/>
       </w:pPr>
       <w:r>
         <w:t>A Report Submitted</w:t>
@@ -43,6 +46,7 @@
     <w:p>
       <w:pPr>
         <w:pStyle w:val="ReportTitle"/>
+        <w:spacing w:line="240" w:lineRule="auto"/>
       </w:pPr>
       <w:r>
         <w:t>In the Partial Fulfillment of the Requirement for the Degree</w:t>
@@ -51,6 +55,7 @@
     <w:p>
       <w:pPr>
         <w:pStyle w:val="ReportTitle"/>
+        <w:spacing w:line="240" w:lineRule="auto"/>
       </w:pPr>
       <w:r>
         <w:t>Computer Engineering under Technical and Vocational Stream</w:t>
@@ -59,6 +64,7 @@
     <w:p>
       <w:pPr>
         <w:pStyle w:val="ReportTitle"/>
+        <w:spacing w:line="240" w:lineRule="auto"/>
       </w:pPr>
       <w:r>
         <w:t>Secondary Level Education (Grade - 10)</w:t>
@@ -81,6 +87,7 @@
     <w:p>
       <w:pPr>
         <w:pStyle w:val="ReportTitle"/>
+        <w:spacing w:line="240" w:lineRule="auto"/>
       </w:pPr>
       <w:r>
         <w:t>Shrawan Shah</w:t>
@@ -103,6 +110,7 @@
     <w:p>
       <w:pPr>
         <w:pStyle w:val="ReportTitle"/>
+        <w:spacing w:line="240" w:lineRule="auto"/>
       </w:pPr>
       <w:r>
         <w:t>Department of Technical and Vocational Stream</w:t>
@@ -111,6 +119,7 @@
     <w:p>
       <w:pPr>
         <w:pStyle w:val="ReportTitle"/>
+        <w:spacing w:line="240" w:lineRule="auto"/>
       </w:pPr>
       <w:r>
         <w:t>National Examination Board, Sanothimi, Bhaktapur</w:t>
@@ -124,6 +133,7 @@
     <w:p>
       <w:pPr>
         <w:pStyle w:val="ReportTitle"/>
+        <w:spacing w:line="240" w:lineRule="auto"/>
       </w:pPr>
       <w:r>
         <w:t>Shrawan, 2083</w:t>
@@ -241,6 +251,7 @@
     </w:p>
     <w:p>
       <w:pPr>
+        <w:spacing w:line="240" w:lineRule="auto"/>
         <w:jc w:val="right"/>
       </w:pPr>
       <w:r>

</xml_diff>

<commit_message>
Revert "Fix: single-space cover page and all signature lines"
This reverts commit cabf022e05679f39c1a30f6ae61c50c972277fdf.
</commit_message>
<xml_diff>
--- a/report/OneStepPharmacy_OJT_Report.docx
+++ b/report/OneStepPharmacy_OJT_Report.docx
@@ -5,7 +5,6 @@
     <w:p>
       <w:pPr>
         <w:pStyle w:val="ReportTitle"/>
-        <w:spacing w:line="240" w:lineRule="auto"/>
       </w:pPr>
       <w:r>
         <w:t>On-The-Job Training (OJT) Report on</w:t>
@@ -14,7 +13,6 @@
     <w:p>
       <w:pPr>
         <w:pStyle w:val="ReportTitle"/>
-        <w:spacing w:line="240" w:lineRule="auto"/>
       </w:pPr>
       <w:r>
         <w:t>OneStep Pharmacy E-commerce at</w:t>
@@ -37,7 +35,6 @@
     <w:p>
       <w:pPr>
         <w:pStyle w:val="ReportTitle"/>
-        <w:spacing w:line="240" w:lineRule="auto"/>
       </w:pPr>
       <w:r>
         <w:t>A Report Submitted</w:t>
@@ -46,7 +43,6 @@
     <w:p>
       <w:pPr>
         <w:pStyle w:val="ReportTitle"/>
-        <w:spacing w:line="240" w:lineRule="auto"/>
       </w:pPr>
       <w:r>
         <w:t>In the Partial Fulfillment of the Requirement for the Degree</w:t>
@@ -55,7 +51,6 @@
     <w:p>
       <w:pPr>
         <w:pStyle w:val="ReportTitle"/>
-        <w:spacing w:line="240" w:lineRule="auto"/>
       </w:pPr>
       <w:r>
         <w:t>Computer Engineering under Technical and Vocational Stream</w:t>
@@ -64,7 +59,6 @@
     <w:p>
       <w:pPr>
         <w:pStyle w:val="ReportTitle"/>
-        <w:spacing w:line="240" w:lineRule="auto"/>
       </w:pPr>
       <w:r>
         <w:t>Secondary Level Education (Grade - 10)</w:t>
@@ -87,7 +81,6 @@
     <w:p>
       <w:pPr>
         <w:pStyle w:val="ReportTitle"/>
-        <w:spacing w:line="240" w:lineRule="auto"/>
       </w:pPr>
       <w:r>
         <w:t>Shrawan Shah</w:t>
@@ -110,7 +103,6 @@
     <w:p>
       <w:pPr>
         <w:pStyle w:val="ReportTitle"/>
-        <w:spacing w:line="240" w:lineRule="auto"/>
       </w:pPr>
       <w:r>
         <w:t>Department of Technical and Vocational Stream</w:t>
@@ -119,7 +111,6 @@
     <w:p>
       <w:pPr>
         <w:pStyle w:val="ReportTitle"/>
-        <w:spacing w:line="240" w:lineRule="auto"/>
       </w:pPr>
       <w:r>
         <w:t>National Examination Board, Sanothimi, Bhaktapur</w:t>
@@ -133,7 +124,6 @@
     <w:p>
       <w:pPr>
         <w:pStyle w:val="ReportTitle"/>
-        <w:spacing w:line="240" w:lineRule="auto"/>
       </w:pPr>
       <w:r>
         <w:t>Shrawan, 2083</w:t>
@@ -251,7 +241,6 @@
     </w:p>
     <w:p>
       <w:pPr>
-        <w:spacing w:line="240" w:lineRule="auto"/>
         <w:jc w:val="right"/>
       </w:pPr>
       <w:r>

</xml_diff>